<commit_message>
Refactor case study documentation and architecture diagrams for clarity and consistency
- Updated the title and subject in the case study document to reflect integration with Adobe, SAP, and FWT.
- Revised the scope and recommendation sections for improved clarity.
- Enhanced the architecture and journey diagrams to better represent the integration flow and terminology.
- Adjusted the sequence diagram to clarify the Adobe input process and its relation to the RabbitMQ queue.
- Made minor textual adjustments throughout the documentation for consistency and readability.
</commit_message>
<xml_diff>
--- a/docs/Orbital-Customer-Account-POC-Case-Study.docx
+++ b/docs/Orbital-Customer-Account-POC-Case-Study.docx
@@ -72,7 +72,7 @@
           <w:color w:val="2F5597"/>
           <w:sz w:val="32"/>
         </w:rPr>
-        <w:t>A case study in semantic integration with Taxi</w:t>
+        <w:t>Adobe, SAP and FWT integration using Taxi</w:t>
       </w:r>
     </w:p>
     <w:p>
@@ -92,7 +92,7 @@
           <w:color w:val="344054"/>
           <w:sz w:val="22"/>
         </w:rPr>
-        <w:t>Adobe, SAP and FWT customer-account updates using Orbital, Taxi, RabbitMQ and a narrow Python transport bridge</w:t>
+        <w:t>Customer-account updates using Orbital, Taxi, RabbitMQ and a small Python transport bridge</w:t>
       </w:r>
     </w:p>
     <w:tbl>
@@ -232,7 +232,7 @@
                 <w:color w:val="17365D"/>
                 <w:sz w:val="18"/>
               </w:rPr>
-              <w:t>Selected-slice POC; not production-ready</w:t>
+              <w:t>POC covering selected customer-account fields; not production-ready</w:t>
             </w:r>
           </w:p>
         </w:tc>
@@ -288,7 +288,7 @@
               <w:spacing w:after="0"/>
             </w:pPr>
             <w:r>
-              <w:t>Pilot the Taxi model with production-grade connectivity. Do not replace Azure transport based on this POC; decide broker migration separately.</w:t>
+              <w:t>Test the Taxi model with the existing Azure connections or a supported connector. Do not replace Azure transport based on this POC.</w:t>
             </w:r>
           </w:p>
         </w:tc>
@@ -374,7 +374,7 @@
         <w:t xml:space="preserve">4.  </w:t>
       </w:r>
       <w:r>
-        <w:t>Implementation lessons</w:t>
+        <w:t>Implementation notes</w:t>
       </w:r>
     </w:p>
     <w:p>
@@ -406,7 +406,7 @@
         <w:t xml:space="preserve">6.  </w:t>
       </w:r>
       <w:r>
-        <w:t>POC compared with the current Azure BIP</w:t>
+        <w:t>Comparison with the current Azure BIP</w:t>
       </w:r>
     </w:p>
     <w:p>
@@ -467,7 +467,7 @@
     </w:p>
     <w:p>
       <w:r>
-        <w:t xml:space="preserve">This document compares the POC with the customer-account implementation in the local </w:t>
+        <w:t xml:space="preserve">This review covers the customer-account implementation in the local </w:t>
       </w:r>
       <w:r>
         <w:rPr>
@@ -476,7 +476,7 @@
         <w:t>bip</w:t>
       </w:r>
       <w:r>
-        <w:t xml:space="preserve"> repository. It does not compare every Orbital or Azure capability. Evidence comes from code, fixtures, tests, package health and local smoke tests—not production load, security or cost studies.</w:t>
+        <w:t xml:space="preserve"> repository. It uses local code, fixtures, tests, package health and smoke tests. No production load, security or cost testing was performed, and the review does not cover every Orbital or Azure feature.</w:t>
       </w:r>
     </w:p>
     <w:p>
@@ -493,10 +493,10 @@
     </w:p>
     <w:p>
       <w:pPr>
-        <w:pStyle w:val="Heading2"/>
+        <w:pStyle w:val="ListBullet"/>
       </w:pPr>
       <w:r>
-        <w:t>Bottom line</w:t>
+        <w:t>Shared Taxi types mapped the customer-account fields covered by this POC across Adobe, SAP and FWT. Each system kept its own payload.</w:t>
       </w:r>
     </w:p>
     <w:p>
@@ -504,13 +504,7 @@
         <w:pStyle w:val="ListBullet"/>
       </w:pPr>
       <w:r>
-        <w:rPr>
-          <w:b/>
-        </w:rPr>
-        <w:t>Semantic reuse worked.</w:t>
-      </w:r>
-      <w:r>
-        <w:t xml:space="preserve"> Shared Taxi facts drove a selected update slice across Adobe, SAP and FWT without forcing one physical customer DTO.</w:t>
+        <w:t>The POC did not establish production readiness. It used no real endpoints and does not cover all fields, retries, idempotency, HA, security controls or service ownership.</w:t>
       </w:r>
     </w:p>
     <w:p>
@@ -518,27 +512,7 @@
         <w:pStyle w:val="ListBullet"/>
       </w:pPr>
       <w:r>
-        <w:rPr>
-          <w:b/>
-        </w:rPr>
-        <w:t>The POC is not production-ready.</w:t>
-      </w:r>
-      <w:r>
-        <w:t xml:space="preserve"> Real endpoints, full field parity, retries, idempotency, HA, security and operational ownership were not proven.</w:t>
-      </w:r>
-    </w:p>
-    <w:p>
-      <w:pPr>
-        <w:pStyle w:val="ListBullet"/>
-      </w:pPr>
-      <w:r>
-        <w:rPr>
-          <w:b/>
-        </w:rPr>
-        <w:t>Keep the Taxi model; test transport separately.</w:t>
-      </w:r>
-      <w:r>
-        <w:t xml:space="preserve"> The next test should combine Orbital projections with existing Azure connectivity or a supported native connector.</w:t>
+        <w:t>The next test should run the Orbital mappings through existing Azure connections or a supported connector.</w:t>
       </w:r>
     </w:p>
     <w:p>
@@ -689,7 +663,7 @@
               <w:rPr>
                 <w:sz w:val="16"/>
               </w:rPr>
-              <w:t>Adobe→SAP, Adobe→FWT, SAP→Adobe, SAP→FWT</w:t>
+              <w:t>Adobe to SAP, Adobe to FWT, SAP to Adobe, SAP to FWT</w:t>
             </w:r>
           </w:p>
         </w:tc>
@@ -1050,7 +1024,7 @@
               <w:rPr>
                 <w:sz w:val="16"/>
               </w:rPr>
-              <w:t>Strongest result</w:t>
+              <w:t>What worked</w:t>
             </w:r>
           </w:p>
         </w:tc>
@@ -1079,7 +1053,7 @@
               <w:rPr>
                 <w:sz w:val="16"/>
               </w:rPr>
-              <w:t>Reusable Taxi semantics across three wire contracts</w:t>
+              <w:t>Shared Taxi types mapped Adobe, SAP and FWT payloads</w:t>
             </w:r>
           </w:p>
         </w:tc>
@@ -1115,7 +1089,7 @@
               <w:rPr>
                 <w:sz w:val="16"/>
               </w:rPr>
-              <w:t>Largest gap</w:t>
+              <w:t>What is missing</w:t>
             </w:r>
           </w:p>
         </w:tc>
@@ -1145,7 +1119,7 @@
               <w:rPr>
                 <w:sz w:val="16"/>
               </w:rPr>
-              <w:t>No production connector, resilience, security or ownership proof</w:t>
+              <w:t>Production connector, resilience tests, security design and named owner</w:t>
             </w:r>
           </w:p>
         </w:tc>
@@ -1258,7 +1232,7 @@
         <w:t xml:space="preserve">5.  </w:t>
       </w:r>
       <w:r>
-        <w:t>reuse Taxi business definitions while preserving system-owned contracts.</w:t>
+        <w:t>reuse Taxi business definitions while keeping separate Adobe, SAP and FWT payloads.</w:t>
       </w:r>
     </w:p>
     <w:p>
@@ -1915,7 +1889,7 @@
               <w:rPr>
                 <w:sz w:val="16"/>
               </w:rPr>
-              <w:t>Azure workflow, archive and notification patterns</w:t>
+              <w:t>Logic App run history, payload archive and failure notifications</w:t>
             </w:r>
           </w:p>
         </w:tc>
@@ -2172,7 +2146,7 @@
               <w:rPr>
                 <w:sz w:val="16"/>
               </w:rPr>
-              <w:t>Create flows and full contract parity</w:t>
+              <w:t>Create flows and all production fields and behaviours</w:t>
             </w:r>
           </w:p>
         </w:tc>
@@ -2505,8 +2479,8 @@
           <w:noProof/>
         </w:rPr>
         <w:drawing>
-          <wp:inline distT="0" distB="0" distL="0" distR="0" wp14:anchorId="3E9C189F" wp14:editId="05695ABD">
-            <wp:extent cx="5989320" cy="6919456"/>
+          <wp:inline distT="0" distB="0" distL="0" distR="0" wp14:anchorId="6B652E62" wp14:editId="23B14A88">
+            <wp:extent cx="5989320" cy="7089143"/>
             <wp:effectExtent l="0" t="0" r="0" b="0"/>
             <wp:docPr id="1" name="Picture 1" descr="Architecture showing Adobe and SAP inputs flowing through reusable Taxi projections, the transport-only bridge and RabbitMQ layer, and independent SAP, Adobe and FWT outcomes"/>
             <wp:cNvGraphicFramePr>
@@ -2528,7 +2502,7 @@
                   <pic:spPr>
                     <a:xfrm>
                       <a:off x="0" y="0"/>
-                      <a:ext cx="5989320" cy="6919456"/>
+                      <a:ext cx="5989320" cy="7089143"/>
                     </a:xfrm>
                     <a:prstGeom prst="rect">
                       <a:avLst/>
@@ -2546,7 +2520,7 @@
         <w:pStyle w:val="CaseCaption"/>
       </w:pPr>
       <w:r>
-        <w:t>Figure 1 — POC architecture. Taxi owns business meaning and projection. The bridge and RabbitMQ own transport. Green nodes are sources or simulated outcomes.</w:t>
+        <w:t>Figure 1: POC architecture. Taxi handles mapping. The bridge and RabbitMQ handle transport. Green boxes are sources or simulated outputs.</w:t>
       </w:r>
     </w:p>
     <w:p>
@@ -2652,7 +2626,7 @@
                 <w:color w:val="FFFFFF"/>
                 <w:sz w:val="16"/>
               </w:rPr>
-              <w:t>Routing key → queue</w:t>
+              <w:t>Routing key and queue</w:t>
             </w:r>
           </w:p>
         </w:tc>
@@ -2796,7 +2770,7 @@
               <w:rPr>
                 <w:sz w:val="16"/>
               </w:rPr>
-              <w:t xml:space="preserve">→ </w:t>
+              <w:t xml:space="preserve">queue: </w:t>
             </w:r>
             <w:r>
               <w:rPr>
@@ -2942,7 +2916,7 @@
               <w:rPr>
                 <w:sz w:val="16"/>
               </w:rPr>
-              <w:t xml:space="preserve">→ </w:t>
+              <w:t xml:space="preserve">queue: </w:t>
             </w:r>
             <w:r>
               <w:rPr>
@@ -3088,7 +3062,7 @@
               <w:rPr>
                 <w:sz w:val="16"/>
               </w:rPr>
-              <w:t xml:space="preserve">→ </w:t>
+              <w:t xml:space="preserve">queue: </w:t>
             </w:r>
             <w:r>
               <w:rPr>
@@ -3232,7 +3206,7 @@
               <w:rPr>
                 <w:sz w:val="16"/>
               </w:rPr>
-              <w:t xml:space="preserve">→ </w:t>
+              <w:t xml:space="preserve">queue: </w:t>
             </w:r>
             <w:r>
               <w:rPr>
@@ -3311,12 +3285,12 @@
     </w:p>
     <w:p>
       <w:r>
-        <w:t>Bindings route only those four source-to-target paths. No FWT-origin route exists. This is topology-level loop prevention only; production idempotency and source suppression remain open.</w:t>
+        <w:t>Bindings route only those four source-to-target paths. There is no FWT-origin route. This prevents routing loops in the POC, but it does not prevent duplicate business updates.</w:t>
       </w:r>
     </w:p>
     <w:p>
       <w:r>
-        <w:t>The retained Adobe→SAP copy does not emit a SAP return; SAP-origin tests are injected separately. This reproduces local fan-out behaviour, not BIP topology or wire-format parity—RabbitMQ carries SAP XML.</w:t>
+        <w:t>The Adobe-to-SAP queue does not emit a SAP return. SAP-origin tests are injected separately. The local queues do not match the BIP topology or payload format; RabbitMQ carries SAP XML.</w:t>
       </w:r>
     </w:p>
     <w:p>
@@ -3329,7 +3303,7 @@
     </w:p>
     <w:p>
       <w:r>
-        <w:t>Taxi keeps each wire contract independent and maps equivalent business concepts through narrow types and enum synonyms.</w:t>
+        <w:t>Adobe, SAP and FWT keep separate payloads. Taxi reuses named types and enum values for fields that mean the same thing.</w:t>
       </w:r>
     </w:p>
     <w:tbl>
@@ -3832,7 +3806,7 @@
               <w:rPr>
                 <w:sz w:val="16"/>
               </w:rPr>
-              <w:t>Supply an explicit cross-reference for SAP→Adobe</w:t>
+              <w:t>Supply an explicit cross-reference for SAP-to-Adobe</w:t>
             </w:r>
           </w:p>
         </w:tc>
@@ -4458,7 +4432,7 @@
               <w:rPr>
                 <w:sz w:val="16"/>
               </w:rPr>
-              <w:t>Keep target ownership and field meaning</w:t>
+              <w:t>Keep target-specific fields separate</w:t>
             </w:r>
           </w:p>
         </w:tc>
@@ -5058,7 +5032,7 @@
               <w:rPr>
                 <w:sz w:val="16"/>
               </w:rPr>
-              <w:t>Observable Adobe/FWT test responses</w:t>
+              <w:t>Captured Adobe/FWT requests and fixed responses</w:t>
             </w:r>
           </w:p>
         </w:tc>
@@ -5100,7 +5074,7 @@
     </w:p>
     <w:p>
       <w:r>
-        <w:t>The bridge exists because this deployed workspace has HTTP connectivity but no configured supported AMQP Taxi connector. A supported native connector can replace it without changing the Taxi mappings.</w:t>
+        <w:t>The deployed Orbital workspace exposes HTTP, but no supported AMQP Taxi connector was configured. The Python bridge fills that gap. A supported native connector can replace it without changing the Taxi mappings.</w:t>
       </w:r>
     </w:p>
     <w:p>
@@ -5123,8 +5097,8 @@
           <w:noProof/>
         </w:rPr>
         <w:drawing>
-          <wp:inline distT="0" distB="0" distL="0" distR="0" wp14:anchorId="35CAC95F" wp14:editId="3F9C0AA4">
-            <wp:extent cx="5989320" cy="7738595"/>
+          <wp:inline distT="0" distB="0" distL="0" distR="0" wp14:anchorId="638510A8" wp14:editId="02DCE14A">
+            <wp:extent cx="5989320" cy="7653247"/>
             <wp:effectExtent l="0" t="0" r="0" b="0"/>
             <wp:docPr id="2" name="Picture 2" descr="Sequence showing separate Adobe and SAP ingress paths, confirmed RabbitMQ publication, independent route delivery, acknowledgement after success, and route-specific dead-lettering after failure"/>
             <wp:cNvGraphicFramePr>
@@ -5146,7 +5120,7 @@
                   <pic:spPr>
                     <a:xfrm>
                       <a:off x="0" y="0"/>
-                      <a:ext cx="5989320" cy="7738595"/>
+                      <a:ext cx="5989320" cy="7653247"/>
                     </a:xfrm>
                     <a:prstGeom prst="rect">
                       <a:avLst/>
@@ -5164,7 +5138,7 @@
         <w:pStyle w:val="CaseCaption"/>
       </w:pPr>
       <w:r>
-        <w:t xml:space="preserve">Figure 2 — Publish and route delivery. Each consumed route copy uses </w:t>
+        <w:t xml:space="preserve">Figure 2: Publish and route delivery. Each worker uses </w:t>
       </w:r>
       <w:r>
         <w:rPr>
@@ -5173,7 +5147,7 @@
         <w:t>prefetch=1</w:t>
       </w:r>
       <w:r>
-        <w:t>, is acknowledged only after its Orbital saved query returns 2xx following the target call, and is dead-lettered independently on failure. Ingress success confirms publication—not every subscriber. Adobe→SAP remains unconsumed as the simulated target.</w:t>
+        <w:t xml:space="preserve"> and sends an ACK only after Orbital returns 2xx from the saved query. A failed route goes to its DLQ. A successful ingress only means RabbitMQ accepted the publish. Adobe-to-SAP is the unconsumed SAP stub.</w:t>
       </w:r>
     </w:p>
     <w:p>
@@ -5185,7 +5159,7 @@
       </w:pPr>
       <w:r>
         <w:lastRenderedPageBreak/>
-        <w:t>4. Implementation lessons</w:t>
+        <w:t>4. Implementation notes</w:t>
       </w:r>
     </w:p>
     <w:p>
@@ -5207,8 +5181,8 @@
           <w:noProof/>
         </w:rPr>
         <w:drawing>
-          <wp:inline distT="0" distB="0" distL="0" distR="0" wp14:anchorId="60511A35" wp14:editId="22673AEC">
-            <wp:extent cx="5989320" cy="1537488"/>
+          <wp:inline distT="0" distB="0" distL="0" distR="0" wp14:anchorId="6EBB88B4" wp14:editId="2B7863C5">
+            <wp:extent cx="5989320" cy="1486239"/>
             <wp:effectExtent l="0" t="0" r="0" b="0"/>
             <wp:docPr id="3" name="Picture 3" descr="Three-stage implementation journey from the core Adobe and SAP routes through a typed FWT extension to local verification"/>
             <wp:cNvGraphicFramePr>
@@ -5230,7 +5204,7 @@
                   <pic:spPr>
                     <a:xfrm>
                       <a:off x="0" y="0"/>
-                      <a:ext cx="5989320" cy="1537488"/>
+                      <a:ext cx="5989320" cy="1486239"/>
                     </a:xfrm>
                     <a:prstGeom prst="rect">
                       <a:avLst/>
@@ -5248,7 +5222,7 @@
         <w:pStyle w:val="CaseCaption"/>
       </w:pPr>
       <w:r>
-        <w:t>Figure 3 — Implementation path. Core routes came first, the shared model was extended to FWT, then local verification was added.</w:t>
+        <w:t>Figure 3: Implementation path. Work was completed in three stages: core routes, FWT routes and local checks.</w:t>
       </w:r>
     </w:p>
     <w:p>
@@ -5261,7 +5235,7 @@
     </w:p>
     <w:p>
       <w:r>
-        <w:t>The XML findings below apply to the tested Orbital 0.38 version and configuration; they are not product-wide claims.</w:t>
+        <w:t>These XML findings were observed on Orbital 0.38 in this setup. They should be retested after any runtime upgrade.</w:t>
       </w:r>
     </w:p>
     <w:tbl>
@@ -5373,7 +5347,7 @@
                 <w:color w:val="FFFFFF"/>
                 <w:sz w:val="16"/>
               </w:rPr>
-              <w:t>Lesson</w:t>
+              <w:t>Finding</w:t>
             </w:r>
           </w:p>
         </w:tc>
@@ -5874,7 +5848,7 @@
               <w:rPr>
                 <w:sz w:val="16"/>
               </w:rPr>
-              <w:t>Resolve identities explicitly; do not treat one system ID as another</w:t>
+              <w:t>System IDs need explicit mapping</w:t>
             </w:r>
           </w:p>
         </w:tc>
@@ -6159,7 +6133,7 @@
               <w:rPr>
                 <w:sz w:val="16"/>
               </w:rPr>
-              <w:t>Treat them as one release</w:t>
+              <w:t>Deploy source and runtime changes together</w:t>
             </w:r>
           </w:p>
         </w:tc>
@@ -6223,7 +6197,7 @@
               <w:rPr>
                 <w:sz w:val="16"/>
               </w:rPr>
-              <w:t>Left duplicate policy explicit and unresolved</w:t>
+              <w:t>Documented the gap; no deduplication rule yet</w:t>
             </w:r>
           </w:p>
         </w:tc>
@@ -6252,7 +6226,7 @@
               <w:rPr>
                 <w:sz w:val="16"/>
               </w:rPr>
-              <w:t>Fan-out can duplicate effects without forming a loop</w:t>
+              <w:t>Fan-out can create duplicate updates without a routing loop</w:t>
             </w:r>
           </w:p>
         </w:tc>
@@ -6427,7 +6401,7 @@
               <w:rPr>
                 <w:sz w:val="16"/>
               </w:rPr>
-              <w:t>Shared semantics span three contracts</w:t>
+              <w:t>The same Taxi types are used to build Adobe, SAP and FWT payloads</w:t>
             </w:r>
           </w:p>
         </w:tc>
@@ -6456,7 +6430,7 @@
               <w:rPr>
                 <w:sz w:val="16"/>
               </w:rPr>
-              <w:t>Taxi facts/enums drive Adobe, SAP and FWT shapes</w:t>
+              <w:t>Taxi facts and enums build all three payload shapes</w:t>
             </w:r>
           </w:p>
         </w:tc>
@@ -6485,7 +6459,7 @@
               <w:rPr>
                 <w:sz w:val="16"/>
               </w:rPr>
-              <w:t>Proven for selected fields</w:t>
+              <w:t>Covered for selected fields</w:t>
             </w:r>
           </w:p>
         </w:tc>
@@ -6521,7 +6495,7 @@
               <w:rPr>
                 <w:sz w:val="16"/>
               </w:rPr>
-              <w:t>Adobe reaches simulated SAP</w:t>
+              <w:t>Adobe input reaches the simulated SAP queue</w:t>
             </w:r>
           </w:p>
         </w:tc>
@@ -6551,7 +6525,7 @@
               <w:rPr>
                 <w:sz w:val="16"/>
               </w:rPr>
-              <w:t>Expected XML reaches retained SAP queue</w:t>
+              <w:t>The retained XML matches the expected fixture</w:t>
             </w:r>
           </w:p>
         </w:tc>
@@ -6581,7 +6555,7 @@
               <w:rPr>
                 <w:sz w:val="16"/>
               </w:rPr>
-              <w:t>Proven with fixture</w:t>
+              <w:t>Matched expected fixture</w:t>
             </w:r>
           </w:p>
         </w:tc>
@@ -6616,7 +6590,7 @@
               <w:rPr>
                 <w:sz w:val="16"/>
               </w:rPr>
-              <w:t>Adobe reaches FWT independently</w:t>
+              <w:t>Adobe input reaches FWT independently</w:t>
             </w:r>
           </w:p>
         </w:tc>
@@ -6674,7 +6648,7 @@
               <w:rPr>
                 <w:sz w:val="16"/>
               </w:rPr>
-              <w:t>Proven with fixture</w:t>
+              <w:t>Matched expected fixture</w:t>
             </w:r>
           </w:p>
         </w:tc>
@@ -6710,7 +6684,7 @@
               <w:rPr>
                 <w:sz w:val="16"/>
               </w:rPr>
-              <w:t>SAP reaches Adobe and FWT independently</w:t>
+              <w:t>SAP input reaches Adobe and FWT independently</w:t>
             </w:r>
           </w:p>
         </w:tc>
@@ -6770,7 +6744,7 @@
               <w:rPr>
                 <w:sz w:val="16"/>
               </w:rPr>
-              <w:t>Proven with fixture</w:t>
+              <w:t>Matched expected fixtures</w:t>
             </w:r>
           </w:p>
         </w:tc>
@@ -6805,7 +6779,7 @@
               <w:rPr>
                 <w:sz w:val="16"/>
               </w:rPr>
-              <w:t>Delivery mechanics are explicit</w:t>
+              <w:t>Publisher confirms, ACKs and DLQs work per route</w:t>
             </w:r>
           </w:p>
         </w:tc>
@@ -6863,7 +6837,7 @@
               <w:rPr>
                 <w:sz w:val="16"/>
               </w:rPr>
-              <w:t>Component pattern proven</w:t>
+              <w:t>Passed component tests</w:t>
             </w:r>
           </w:p>
         </w:tc>
@@ -6899,7 +6873,7 @@
               <w:rPr>
                 <w:sz w:val="16"/>
               </w:rPr>
-              <w:t>Taxi package is clean</w:t>
+              <w:t>Taxi compiles without warnings or errors</w:t>
             </w:r>
           </w:p>
         </w:tc>
@@ -6929,7 +6903,7 @@
               <w:rPr>
                 <w:sz w:val="16"/>
               </w:rPr>
-              <w:t>11 sources; healthy; 0 warnings; 0 errors</w:t>
+              <w:t>11 healthy sources; 0 warnings; 0 errors</w:t>
             </w:r>
           </w:p>
         </w:tc>
@@ -6959,7 +6933,7 @@
               <w:rPr>
                 <w:sz w:val="16"/>
               </w:rPr>
-              <w:t>Proven in tested workspace</w:t>
+              <w:t>Checked in this workspace</w:t>
             </w:r>
           </w:p>
         </w:tc>
@@ -6994,7 +6968,7 @@
               <w:rPr>
                 <w:sz w:val="16"/>
               </w:rPr>
-              <w:t>Bridge component is tested</w:t>
+              <w:t>The bridge passes its component tests</w:t>
             </w:r>
           </w:p>
         </w:tc>
@@ -7052,7 +7026,7 @@
               <w:rPr>
                 <w:sz w:val="16"/>
               </w:rPr>
-              <w:t>Proven at component level</w:t>
+              <w:t>Passed component tests</w:t>
             </w:r>
           </w:p>
         </w:tc>
@@ -7088,7 +7062,7 @@
               <w:rPr>
                 <w:sz w:val="16"/>
               </w:rPr>
-              <w:t>Production replacement readiness</w:t>
+              <w:t>Production use</w:t>
             </w:r>
           </w:p>
         </w:tc>
@@ -7118,7 +7092,7 @@
               <w:rPr>
                 <w:sz w:val="16"/>
               </w:rPr>
-              <w:t>Real systems, parity, resilience and security untested</w:t>
+              <w:t>Real systems, parity, resilience and security were not tested</w:t>
             </w:r>
           </w:p>
         </w:tc>
@@ -7148,7 +7122,7 @@
               <w:rPr>
                 <w:sz w:val="16"/>
               </w:rPr>
-              <w:t>Not proven</w:t>
+              <w:t>Not tested</w:t>
             </w:r>
           </w:p>
         </w:tc>
@@ -7172,7 +7146,7 @@
         <w:pStyle w:val="ListBullet"/>
       </w:pPr>
       <w:r>
-        <w:t>Fixtures prove a selected update slice, not complete BIP or FWT behaviour.</w:t>
+        <w:t>Fixtures cover only the fields in this POC, not all BIP or FWT behaviour.</w:t>
       </w:r>
     </w:p>
     <w:p>
@@ -7180,7 +7154,7 @@
         <w:pStyle w:val="ListBullet"/>
       </w:pPr>
       <w:r>
-        <w:t>Unsupported FWT fields were deliberately excluded until authoritative, deterministic sources are available.</w:t>
+        <w:t>FWT fields with no trusted source were left out.</w:t>
       </w:r>
     </w:p>
     <w:p>
@@ -7196,7 +7170,7 @@
         <w:pStyle w:val="ListBullet"/>
       </w:pPr>
       <w:r>
-        <w:t>Nebula captures requests but is not a contract-testing or system-of-record service; concurrent matching is unsafe until captures record lineage/correlation IDs.</w:t>
+        <w:t>Nebula records requests; it does not validate or persist customers. Parallel tests can match the wrong capture until each record includes a correlation ID.</w:t>
       </w:r>
     </w:p>
     <w:p>
@@ -7241,7 +7215,7 @@
       </w:pPr>
       <w:r>
         <w:lastRenderedPageBreak/>
-        <w:t>6. POC compared with the current Azure BIP</w:t>
+        <w:t>6. Comparison with the current Azure BIP</w:t>
       </w:r>
     </w:p>
     <w:p>
@@ -7425,7 +7399,7 @@
               <w:rPr>
                 <w:sz w:val="16"/>
               </w:rPr>
-              <w:t>Typed facts, enum synonyms and compiler feedback make intent explicit</w:t>
+              <w:t>Taxi puts mapping rules in one place and lets the compiler flag mismatches</w:t>
             </w:r>
           </w:p>
         </w:tc>
@@ -7454,7 +7428,7 @@
               <w:rPr>
                 <w:sz w:val="16"/>
               </w:rPr>
-              <w:t>Broader production mapping exists, but intent is spread across C#, schemas and workflows</w:t>
+              <w:t>Broader production mapping exists, but rules are spread across C#, schemas and workflows</w:t>
             </w:r>
           </w:p>
         </w:tc>
@@ -7550,7 +7524,7 @@
               <w:rPr>
                 <w:sz w:val="16"/>
               </w:rPr>
-              <w:t>Established Function/Logic App patterns and larger connector ecosystem</w:t>
+              <w:t>Existing Function/Logic App deployments and managed connectors</w:t>
             </w:r>
           </w:p>
         </w:tc>
@@ -7614,7 +7588,7 @@
               <w:rPr>
                 <w:sz w:val="16"/>
               </w:rPr>
-              <w:t>Explicit per-edge queues, ACK and DLQ state</w:t>
+              <w:t>A separate queue and DLQ for each route</w:t>
             </w:r>
           </w:p>
         </w:tc>
@@ -7739,7 +7713,7 @@
               <w:rPr>
                 <w:sz w:val="16"/>
               </w:rPr>
-              <w:t>Inspected Function actions disable retry; deployed Service Bus settlement, max-delivery and connector policies were not verified</w:t>
+              <w:t>Some inspected Functions disable retries. Live Service Bus and connector retry/dead-letter settings were not checked</w:t>
             </w:r>
           </w:p>
         </w:tc>
@@ -7898,7 +7872,7 @@
               <w:rPr>
                 <w:sz w:val="16"/>
               </w:rPr>
-              <w:t>Safe synthetic environment only</w:t>
+              <w:t>Local stubs; production security was not tested</w:t>
             </w:r>
           </w:p>
         </w:tc>
@@ -7928,7 +7902,7 @@
               <w:rPr>
                 <w:sz w:val="16"/>
               </w:rPr>
-              <w:t>Existing OAuth/connector resources; the POC did not test equivalent controls</w:t>
+              <w:t>Existing OAuth and connector resources; the POC did not test equivalent controls</w:t>
             </w:r>
           </w:p>
         </w:tc>
@@ -7963,7 +7937,7 @@
               <w:rPr>
                 <w:sz w:val="16"/>
               </w:rPr>
-              <w:t>Coverage/maturity</w:t>
+              <w:t>Functional coverage</w:t>
             </w:r>
           </w:p>
         </w:tc>
@@ -7992,7 +7966,7 @@
               <w:rPr>
                 <w:sz w:val="16"/>
               </w:rPr>
-              <w:t>Update-only selected slice; runtime workarounds and custom bridge</w:t>
+              <w:t>Selected update fields, runtime workarounds and a custom bridge</w:t>
             </w:r>
           </w:p>
         </w:tc>
@@ -8280,7 +8254,7 @@
               <w:rPr>
                 <w:sz w:val="16"/>
               </w:rPr>
-              <w:t>SAP-shaped broker event</w:t>
+              <w:t>SAP-shaped broker message</w:t>
             </w:r>
           </w:p>
         </w:tc>
@@ -8309,7 +8283,7 @@
               <w:rPr>
                 <w:sz w:val="16"/>
               </w:rPr>
-              <w:t>Adobe→FWT passes through SAP IDoc shape, so FWT-only facts may be lost</w:t>
+              <w:t>Adobe-to-FWT passes through SAP IDoc shape, so FWT-only facts may be lost</w:t>
             </w:r>
           </w:p>
         </w:tc>
@@ -8404,7 +8378,7 @@
               <w:rPr>
                 <w:sz w:val="16"/>
               </w:rPr>
-              <w:t>Taxi's value does not depend on RabbitMQ</w:t>
+              <w:t>Taxi mappings can run with another broker</w:t>
             </w:r>
           </w:p>
         </w:tc>
@@ -8434,7 +8408,7 @@
               <w:rPr>
                 <w:sz w:val="16"/>
               </w:rPr>
-              <w:t>Test Azure transport/native connector before changing broker</w:t>
+              <w:t>Test Azure transport or a native connector before changing broker</w:t>
             </w:r>
           </w:p>
         </w:tc>
@@ -8498,7 +8472,7 @@
               <w:rPr>
                 <w:sz w:val="16"/>
               </w:rPr>
-              <w:t xml:space="preserve">POC preserves leading zeroes and requires an Adobe cross-reference; inspected BIP uses SAP </w:t>
+              <w:t xml:space="preserve">The POC keeps leading zeroes and supplies the Adobe ID separately. Some BIP code parses </w:t>
             </w:r>
             <w:r>
               <w:rPr>
@@ -8510,7 +8484,7 @@
               <w:rPr>
                 <w:sz w:val="16"/>
               </w:rPr>
-              <w:t xml:space="preserve"> and integer conversion in parts of the Adobe path</w:t>
+              <w:t xml:space="preserve"> as an integer for Adobe</w:t>
             </w:r>
           </w:p>
         </w:tc>
@@ -8539,7 +8513,7 @@
               <w:rPr>
                 <w:sz w:val="16"/>
               </w:rPr>
-              <w:t>Define authoritative cross-reference and leading-zero policy</w:t>
+              <w:t>Choose who owns the ID cross-reference and preserve leading zeroes</w:t>
             </w:r>
           </w:p>
         </w:tc>
@@ -8575,7 +8549,7 @@
               <w:rPr>
                 <w:sz w:val="16"/>
               </w:rPr>
-              <w:t>Duplicate FWT effects</w:t>
+              <w:t>Duplicate FWT updates</w:t>
             </w:r>
           </w:p>
         </w:tc>
@@ -8635,7 +8609,7 @@
               <w:rPr>
                 <w:sz w:val="16"/>
               </w:rPr>
-              <w:t>Define business key, version and deduplication policy</w:t>
+              <w:t>Choose the deduplication key and decide whether an Adobe update plus SAP confirmation counts as one change</w:t>
             </w:r>
           </w:p>
         </w:tc>
@@ -8728,7 +8702,19 @@
               <w:rPr>
                 <w:sz w:val="16"/>
               </w:rPr>
-              <w:t>Choose the external API contract explicitly</w:t>
+              <w:t xml:space="preserve">Decide whether </w:t>
+            </w:r>
+            <w:r>
+              <w:rPr>
+                <w:rStyle w:val="CodeInline"/>
+              </w:rPr>
+              <w:t>202</w:t>
+            </w:r>
+            <w:r>
+              <w:rPr>
+                <w:sz w:val="16"/>
+              </w:rPr>
+              <w:t xml:space="preserve"> means queued or all targets completed</w:t>
             </w:r>
           </w:p>
         </w:tc>
@@ -8824,7 +8810,7 @@
               <w:rPr>
                 <w:sz w:val="16"/>
               </w:rPr>
-              <w:t>Replace with native connector or assign owner, SLO and upgrade policy</w:t>
+              <w:t>Replace it with a native connector, or name the team that will run and upgrade it and set an SLO</w:t>
             </w:r>
           </w:p>
         </w:tc>
@@ -8892,7 +8878,7 @@
               <w:spacing w:after="0"/>
             </w:pPr>
             <w:r>
-              <w:t>Pilot Taxi/Orbital mapping with existing Azure transport. Decide on broker replacement separately.</w:t>
+              <w:t>Use Taxi and Orbital mappings with existing Azure transport for the next test. Review broker replacement separately.</w:t>
             </w:r>
           </w:p>
         </w:tc>
@@ -9123,7 +9109,7 @@
               <w:rPr>
                 <w:sz w:val="16"/>
               </w:rPr>
-              <w:t>Lowest migration risk</w:t>
+              <w:t>No migration work</w:t>
             </w:r>
           </w:p>
         </w:tc>
@@ -9153,7 +9139,7 @@
               <w:rPr>
                 <w:sz w:val="16"/>
               </w:rPr>
-              <w:t>Semantic improvement is lost</w:t>
+              <w:t>Taxi model is not used</w:t>
             </w:r>
           </w:p>
         </w:tc>
@@ -9183,7 +9169,7 @@
               <w:rPr>
                 <w:sz w:val="16"/>
               </w:rPr>
-              <w:t>Baseline</w:t>
+              <w:t>Current baseline</w:t>
             </w:r>
           </w:p>
         </w:tc>
@@ -9220,7 +9206,7 @@
               <w:rPr>
                 <w:sz w:val="16"/>
               </w:rPr>
-              <w:t>Taxi/Orbital semantics with Azure transport</w:t>
+              <w:t>Taxi and Orbital mappings with Azure transport</w:t>
             </w:r>
           </w:p>
         </w:tc>
@@ -9251,7 +9237,7 @@
               <w:rPr>
                 <w:sz w:val="16"/>
               </w:rPr>
-              <w:t>Tests Taxi reuse while keeping existing connectivity</w:t>
+              <w:t>Tests Taxi reuse while keeping existing connections</w:t>
             </w:r>
           </w:p>
         </w:tc>
@@ -9282,7 +9268,7 @@
               <w:rPr>
                 <w:sz w:val="16"/>
               </w:rPr>
-              <w:t>Requires a supported connector boundary</w:t>
+              <w:t>Requires a supported connector</w:t>
             </w:r>
           </w:p>
         </w:tc>
@@ -9349,7 +9335,7 @@
               <w:rPr>
                 <w:sz w:val="16"/>
               </w:rPr>
-              <w:t>Full Orbital/RabbitMQ replacement</w:t>
+              <w:t>Full Orbital and RabbitMQ replacement</w:t>
             </w:r>
           </w:p>
         </w:tc>
@@ -9378,7 +9364,7 @@
               <w:rPr>
                 <w:sz w:val="16"/>
               </w:rPr>
-              <w:t>Maximum platform change</w:t>
+              <w:t>Replaces Azure Service Bus and connectors with RabbitMQ and the bridge</w:t>
             </w:r>
           </w:p>
         </w:tc>
@@ -9407,7 +9393,7 @@
               <w:rPr>
                 <w:sz w:val="16"/>
               </w:rPr>
-              <w:t>Reliability, security, skills and migration case unproven</w:t>
+              <w:t>No evidence yet for reliability, security, team support or migration cost</w:t>
             </w:r>
           </w:p>
         </w:tc>
@@ -9468,13 +9454,7 @@
         <w:t xml:space="preserve">1.  </w:t>
       </w:r>
       <w:r>
-        <w:rPr>
-          <w:b/>
-        </w:rPr>
-        <w:t>Verify parity.</w:t>
-      </w:r>
-      <w:r>
-        <w:t xml:space="preserve"> Create a route/field matrix and automate golden-master comparisons against representative BIP payloads.</w:t>
+        <w:t>Build a route and field matrix, then automate comparisons against representative BIP payloads.</w:t>
       </w:r>
     </w:p>
     <w:p>
@@ -9490,13 +9470,7 @@
         <w:t xml:space="preserve">2.  </w:t>
       </w:r>
       <w:r>
-        <w:rPr>
-          <w:b/>
-        </w:rPr>
-        <w:t>Prove connectivity.</w:t>
-      </w:r>
-      <w:r>
-        <w:t xml:space="preserve"> Test Azure Service Bus or a supported native AMQP connector on a pinned Orbital version.</w:t>
+        <w:t>Test Azure Service Bus or a supported native AMQP connector on a pinned Orbital version.</w:t>
       </w:r>
     </w:p>
     <w:p>
@@ -9512,13 +9486,7 @@
         <w:t xml:space="preserve">3.  </w:t>
       </w:r>
       <w:r>
-        <w:rPr>
-          <w:b/>
-        </w:rPr>
-        <w:t>Add delivery controls.</w:t>
-      </w:r>
-      <w:r>
-        <w:t xml:space="preserve"> Add idempotency, retry/backoff, replay, poison handling, lineage and restart tests.</w:t>
+        <w:t>Add idempotency, retry and backoff, replay, poison handling, lineage and restart tests.</w:t>
       </w:r>
     </w:p>
     <w:p>
@@ -9534,13 +9502,7 @@
         <w:t xml:space="preserve">4.  </w:t>
       </w:r>
       <w:r>
-        <w:rPr>
-          <w:b/>
-        </w:rPr>
-        <w:t>Shadow then canary.</w:t>
-      </w:r>
-      <w:r>
-        <w:t xml:space="preserve"> Run with side effects suppressed, reconcile results, then pilot one reversible route with rollback.</w:t>
+        <w:t>Run a shadow test, compare the results, then run one route as a canary with a tested rollback.</w:t>
       </w:r>
     </w:p>
     <w:p>
@@ -9596,7 +9558,7 @@
                 <w:color w:val="FFFFFF"/>
                 <w:sz w:val="16"/>
               </w:rPr>
-              <w:t>Gate</w:t>
+              <w:t>Area</w:t>
             </w:r>
           </w:p>
         </w:tc>
@@ -9629,7 +9591,7 @@
                 <w:color w:val="FFFFFF"/>
                 <w:sz w:val="16"/>
               </w:rPr>
-              <w:t>Minimum evidence</w:t>
+              <w:t>Evidence needed</w:t>
             </w:r>
           </w:p>
         </w:tc>
@@ -9695,7 +9657,7 @@
               <w:rPr>
                 <w:sz w:val="16"/>
               </w:rPr>
-              <w:t>Complete field/rule parity, authoritative cross-reference, duplicate policy, domain sign-off</w:t>
+              <w:t>All required fields and rules match BIP; domain owners agree the ID source and duplicate handling</w:t>
             </w:r>
           </w:p>
         </w:tc>
@@ -9932,7 +9894,7 @@
               <w:rPr>
                 <w:sz w:val="16"/>
               </w:rPr>
-              <w:t>Commercial and support</w:t>
+              <w:t>Cost and ownership</w:t>
             </w:r>
           </w:p>
         </w:tc>
@@ -9961,7 +9923,7 @@
               <w:rPr>
                 <w:sz w:val="16"/>
               </w:rPr>
-              <w:t>Three-year TCO, skills/on-call plan, vendor support and accountable team</w:t>
+              <w:t>Three-year cost estimate, on-call skills, vendor support and a named team</w:t>
             </w:r>
           </w:p>
         </w:tc>
@@ -10142,7 +10104,7 @@
               <w:rPr>
                 <w:sz w:val="16"/>
               </w:rPr>
-              <w:t>Adobe facts → SAP publish model → bridge</w:t>
+              <w:t>Projects Adobe facts into the SAP publish model, then calls the bridge</w:t>
             </w:r>
           </w:p>
         </w:tc>
@@ -10210,7 +10172,7 @@
               <w:rPr>
                 <w:sz w:val="16"/>
               </w:rPr>
-              <w:t>SAP XML + Adobe cross-reference → Adobe write</w:t>
+              <w:t>Projects SAP XML and the Adobe cross-reference into an Adobe write</w:t>
             </w:r>
           </w:p>
         </w:tc>
@@ -10274,7 +10236,7 @@
               <w:rPr>
                 <w:sz w:val="16"/>
               </w:rPr>
-              <w:t>IDoc facts → FWT write</w:t>
+              <w:t>Projects IDoc facts into an FWT write</w:t>
             </w:r>
           </w:p>
         </w:tc>
@@ -10818,7 +10780,7 @@
     </w:p>
     <w:p>
       <w:r>
-        <w:t xml:space="preserve">The detailed implementation and runbook remain in </w:t>
+        <w:t xml:space="preserve">See </w:t>
       </w:r>
       <w:r>
         <w:rPr>
@@ -10827,7 +10789,7 @@
         <w:t>orbital-poc/README.md</w:t>
       </w:r>
       <w:r>
-        <w:t>. BIP examples inspected:</w:t>
+        <w:t xml:space="preserve"> for implementation details and the runbook. These BIP files were reviewed:</w:t>
       </w:r>
     </w:p>
     <w:p>
@@ -11090,7 +11052,7 @@
         <w:color w:val="667085"/>
         <w:sz w:val="16"/>
       </w:rPr>
-      <w:t xml:space="preserve">30 July 2026   •   Page </w:t>
+      <w:t xml:space="preserve">30 July 2026 - Page </w:t>
     </w:r>
     <w:r>
       <w:rPr>
@@ -11234,7 +11196,7 @@
         <w:color w:val="667085"/>
         <w:sz w:val="15"/>
       </w:rPr>
-      <w:t>ORBITAL CUSTOMER ACCOUNT POC  |  CASE STUDY</w:t>
+      <w:t>ORBITAL CUSTOMER ACCOUNT POC - CASE STUDY</w:t>
     </w:r>
   </w:p>
 </w:hdr>
@@ -11423,31 +11385,31 @@
       </w:rPr>
     </w:lvl>
   </w:abstractNum>
-  <w:num w:numId="1" w16cid:durableId="1456411788">
+  <w:num w:numId="1" w16cid:durableId="1830900886">
     <w:abstractNumId w:val="8"/>
   </w:num>
-  <w:num w:numId="2" w16cid:durableId="1607733269">
+  <w:num w:numId="2" w16cid:durableId="1861579424">
     <w:abstractNumId w:val="6"/>
   </w:num>
-  <w:num w:numId="3" w16cid:durableId="999623506">
+  <w:num w:numId="3" w16cid:durableId="357858792">
     <w:abstractNumId w:val="5"/>
   </w:num>
-  <w:num w:numId="4" w16cid:durableId="917792892">
+  <w:num w:numId="4" w16cid:durableId="1784225061">
     <w:abstractNumId w:val="4"/>
   </w:num>
-  <w:num w:numId="5" w16cid:durableId="900941221">
+  <w:num w:numId="5" w16cid:durableId="648823983">
     <w:abstractNumId w:val="7"/>
   </w:num>
-  <w:num w:numId="6" w16cid:durableId="1032268909">
+  <w:num w:numId="6" w16cid:durableId="2004550415">
     <w:abstractNumId w:val="3"/>
   </w:num>
-  <w:num w:numId="7" w16cid:durableId="901213910">
+  <w:num w:numId="7" w16cid:durableId="1694963806">
     <w:abstractNumId w:val="2"/>
   </w:num>
-  <w:num w:numId="8" w16cid:durableId="1688025587">
+  <w:num w:numId="8" w16cid:durableId="1788308669">
     <w:abstractNumId w:val="1"/>
   </w:num>
-  <w:num w:numId="9" w16cid:durableId="2067945114">
+  <w:num w:numId="9" w16cid:durableId="1050685260">
     <w:abstractNumId w:val="0"/>
   </w:num>
 </w:numbering>

</xml_diff>